<commit_message>
Update README and design docs.
</commit_message>
<xml_diff>
--- a/documentation/Sales_Analytics_Pipeline_Solution_Design.docx
+++ b/documentation/Sales_Analytics_Pipeline_Solution_Design.docx
@@ -450,6 +450,14 @@
     </w:p>
     <w:p>
       <w:pPr>
+        <w:spacing w:after="160"/>
+      </w:pPr>
+      <w:r>
+        <w:t xml:space="preserve">Implementation status: deployed and running. Two findings emerged only once real deployment was attempted, both now reflected in the deployed code. First, snow sql -f splits files into separate statements on semicolons, which breaks a Task body written as a raw multi-statement BEGIN...END block — confirmed via an actual failed deploy (syntax error, unexpected end of file). The fix moves each Task's logic into a stored procedure with its body wrapped in $$...$$ dollar-quoting (the same protection the repair UDF's Python body already relied on), with the Task itself reduced to a single CALL statement. Second, the repair UDF originally assumed its input was always a non-null string; real data contains some rows where PAYLOAD:JSON_OBJECT is NULL (not universal per row), and the resulting Python exception aborted the entire calling SQL statement rather than just that row — defeating the quarantine design in Section 6.3 until the UDF was corrected to return NULL on NULL input, matching TRY_PARSE_JSON's existing NULL-handling.</w:t>
+      </w:r>
+    </w:p>
+    <w:p>
+      <w:pPr>
         <w:pStyle w:val="Heading2"/>
         <w:spacing w:after="120" w:before="240"/>
       </w:pPr>
@@ -479,6 +487,14 @@
       </w:pPr>
       <w:r>
         <w:t xml:space="preserve">dim_users includes an IS_INTERNAL flag, derived from a working assumption that email addresses on the dataengineeracademy.com domain (and close typo variants observed in the data) represent internal/test accounts rather than genuine setter/closer activity — see Open Item #5. The flag is kept queryable on the dimension rather than used to silently drop rows, so this assumption can be reversed later without a Silver-layer rebuild.</w:t>
+      </w:r>
+    </w:p>
+    <w:p>
+      <w:pPr>
+        <w:spacing w:after="160"/>
+      </w:pPr>
+      <w:r>
+        <w:t xml:space="preserve">Implementation status: all five KPI views (inbound/outbound strategies booked, all strategies details, sales details, outbound prospect dials) deployed as documented, using field names confirmed from direct inspection of real source data. These represent a first-pass mapping of Section 3's business hierarchy to queryable SQL, not yet validated against Avirup's reference report snapshot — see Section 10, Next Steps. One deployment-sequencing finding worth noting for anyone rebuilding this environment: fact_lead_funnel references CUSTOM_ACTIVITY_FIELDS, a table that only gets created when SP_SILVER_PROCESS actually executes, not when it is merely deployed. Deploying updated code redefines what a stored procedure will do the next time it runs; it does not run it. On a fresh account, SP_BRONZE_LOAD and SP_SILVER_PROCESS must be called manually at least once before the Gold layer can deploy successfully.</w:t>
       </w:r>
     </w:p>
     <w:p>

</xml_diff>